<commit_message>
interin full text commit
</commit_message>
<xml_diff>
--- a/flow/20230905_templates/04-Літургія-НЮ.docx
+++ b/flow/20230905_templates/04-Літургія-НЮ.docx
@@ -2229,7 +2229,7 @@
           <w:szCs w:val="24"/>
           <w:rtl w:val="0"/>
         </w:rPr>
-        <w:t xml:space="preserve">Молитва́ми святи́х Твої́х, Спасе, спаси́ нас.</w:t>
+        <w:t xml:space="preserve">Спаси́ нас, Си́ну Бо́жий, що воскре́с із ме́ртвих, співа́ємо Тобі́: Алилу́я.</w:t>
       </w:r>
       <w:r>
         <w:rPr>
@@ -2288,7 +2288,7 @@
           <w:szCs w:val="24"/>
           <w:rtl w:val="0"/>
         </w:rPr>
-        <w:t xml:space="preserve">Молитва́ми святи́х Твої́х, Спасе, спаси́ нас.</w:t>
+        <w:t xml:space="preserve">Спаси́ нас, Си́ну Бо́жий, що воскре́с із ме́ртвих, співа́ємо Тобі́: Алилу́я.</w:t>
       </w:r>
       <w:r>
         <w:rPr>
@@ -2337,7 +2337,7 @@
           <w:szCs w:val="24"/>
           <w:rtl w:val="0"/>
         </w:rPr>
-        <w:t xml:space="preserve"> Молитва́ми святи́х Твої́х, Спасе, спаси́ нас.</w:t>
+        <w:t xml:space="preserve"> Спаси́ нас, Си́ну Бо́жий, що воскре́с із ме́ртвих, співа́ємо Тобі́: Алилу́я.</w:t>
       </w:r>
       <w:r>
         <w:rPr>
@@ -2875,6 +2875,23 @@
         <w:spacing w:after="120" w:line="240" w:lineRule="auto"/>
         <w:rPr>
           <w:rFonts w:ascii="Times New Roman" w:cs="Times New Roman" w:eastAsia="Times New Roman" w:hAnsi="Times New Roman"/>
+          <w:highlight w:val="darkGray"/>
+        </w:rPr>
+      </w:pPr>
+      <w:r>
+        <w:rPr>
+          <w:rFonts w:ascii="Times New Roman" w:cs="Times New Roman" w:eastAsia="Times New Roman" w:hAnsi="Times New Roman"/>
+          <w:highlight w:val="darkGray"/>
+          <w:rtl w:val="0"/>
+        </w:rPr>
+        <w:t xml:space="preserve">&lt;trysviate&gt;</w:t>
+      </w:r>
+    </w:p>
+    <w:p>
+      <w:pPr>
+        <w:spacing w:after="120" w:line="240" w:lineRule="auto"/>
+        <w:rPr>
+          <w:rFonts w:ascii="Times New Roman" w:cs="Times New Roman" w:eastAsia="Times New Roman" w:hAnsi="Times New Roman"/>
           <w:sz w:val="24"/>
           <w:szCs w:val="24"/>
         </w:rPr>
@@ -2959,8 +2976,6 @@
         <w:spacing w:after="120" w:line="240" w:lineRule="auto"/>
         <w:rPr>
           <w:rFonts w:ascii="Times New Roman" w:cs="Times New Roman" w:eastAsia="Times New Roman" w:hAnsi="Times New Roman"/>
-          <w:i w:val="1"/>
-          <w:color w:val="ff4400"/>
           <w:sz w:val="24"/>
           <w:szCs w:val="24"/>
         </w:rPr>
@@ -2973,6 +2988,26 @@
           <w:rtl w:val="0"/>
         </w:rPr>
         <w:t xml:space="preserve">Хресту́ Твоє́му поклоня́ємось, Влади́ко, і святе́є воскресі́ння Твоє́ сла́вим.</w:t>
+      </w:r>
+    </w:p>
+    <w:p>
+      <w:pPr>
+        <w:spacing w:after="120" w:line="240" w:lineRule="auto"/>
+        <w:rPr>
+          <w:rFonts w:ascii="Times New Roman" w:cs="Times New Roman" w:eastAsia="Times New Roman" w:hAnsi="Times New Roman"/>
+          <w:i w:val="1"/>
+          <w:color w:val="ff4400"/>
+          <w:sz w:val="24"/>
+          <w:szCs w:val="24"/>
+        </w:rPr>
+      </w:pPr>
+      <w:r>
+        <w:rPr>
+          <w:rFonts w:ascii="Times New Roman" w:cs="Times New Roman" w:eastAsia="Times New Roman" w:hAnsi="Times New Roman"/>
+          <w:highlight w:val="darkGray"/>
+          <w:rtl w:val="0"/>
+        </w:rPr>
+        <w:t xml:space="preserve">&lt;/trysviate&gt;</w:t>
       </w:r>
       <w:r>
         <w:rPr>
@@ -5844,7 +5879,7 @@
           <w:szCs w:val="24"/>
           <w:rtl w:val="0"/>
         </w:rPr>
-        <w:t xml:space="preserve">Молитва́ми святи́х Твої́х, Спасе, спаси́ нас.</w:t>
+        <w:t xml:space="preserve">Спаси́ нас, Си́ну Бо́жий, що воскре́с із ме́ртвих, співа́ємо Тобі́: Алилу́я.</w:t>
       </w:r>
       <w:r>
         <w:rPr>
@@ -5903,7 +5938,7 @@
           <w:szCs w:val="24"/>
           <w:rtl w:val="0"/>
         </w:rPr>
-        <w:t xml:space="preserve">Молитва́ми святи́х Твої́х, Спасе, спаси́ нас.</w:t>
+        <w:t xml:space="preserve">Спаси́ нас, Си́ну Бо́жий, що воскре́с із ме́ртвих, співа́ємо Тобі́: Алилу́я.</w:t>
       </w:r>
       <w:r>
         <w:rPr>
@@ -5952,7 +5987,7 @@
           <w:szCs w:val="24"/>
           <w:rtl w:val="0"/>
         </w:rPr>
-        <w:t xml:space="preserve"> Молитва́ми святи́х Твої́х, Спасе, спаси́ нас.</w:t>
+        <w:t xml:space="preserve"> Спаси́ нас, Си́ну Бо́жий, що воскре́с із ме́ртвих, співа́ємо Тобі́: Алилу́я.</w:t>
       </w:r>
       <w:r>
         <w:rPr>
@@ -9515,7 +9550,7 @@
           <w:szCs w:val="24"/>
           <w:rtl w:val="0"/>
         </w:rPr>
-        <w:t xml:space="preserve">Молитва́ми святи́х Твої́х, Спасе, спаси́ нас.</w:t>
+        <w:t xml:space="preserve">Спаси́ нас, Си́ну Бо́жий, що воскре́с із ме́ртвих, співа́ємо Тобі́: Алилу́я.</w:t>
       </w:r>
       <w:r>
         <w:rPr>
@@ -9574,7 +9609,7 @@
           <w:szCs w:val="24"/>
           <w:rtl w:val="0"/>
         </w:rPr>
-        <w:t xml:space="preserve">Молитва́ми святи́х Твої́х, Спасе, спаси́ нас.</w:t>
+        <w:t xml:space="preserve">Спаси́ нас, Си́ну Бо́жий, що воскре́с із ме́ртвих, співа́ємо Тобі́: Алилу́я.</w:t>
       </w:r>
       <w:r>
         <w:rPr>
@@ -9623,7 +9658,7 @@
           <w:szCs w:val="24"/>
           <w:rtl w:val="0"/>
         </w:rPr>
-        <w:t xml:space="preserve"> Молитва́ми святи́х Твої́х, Спасе, спаси́ нас.</w:t>
+        <w:t xml:space="preserve"> Спаси́ нас, Си́ну Бо́жий, що воскре́с із ме́ртвих, співа́ємо Тобі́: Алилу́я.</w:t>
       </w:r>
       <w:r>
         <w:rPr>
@@ -14109,7 +14144,7 @@
           <w:szCs w:val="24"/>
           <w:rtl w:val="0"/>
         </w:rPr>
-        <w:t xml:space="preserve">(Пс. 117.2).</w:t>
+        <w:t xml:space="preserve">(Пс. 117,2).</w:t>
       </w:r>
       <w:r>
         <w:rPr>
@@ -14187,7 +14222,7 @@
           <w:szCs w:val="24"/>
           <w:rtl w:val="0"/>
         </w:rPr>
-        <w:t xml:space="preserve">(Пс.117.3).</w:t>
+        <w:t xml:space="preserve">(Пс. 117,3).</w:t>
       </w:r>
       <w:r>
         <w:rPr>

</xml_diff>